<commit_message>
WIP pre-publication repair (sources, 11-lang rebuild, image records)
</commit_message>
<xml_diff>
--- a/daily/2026-09-02/word/GUIDE_20260902_01_Russia_EV_Import_EAC_OTTC.docx
+++ b/daily/2026-09-02/word/GUIDE_20260902_01_Russia_EV_Import_EAC_OTTC.docx
@@ -781,6 +781,14 @@
         <w:pStyle w:val="ListBullet"/>
       </w:pPr>
       <w:r>
+        <w:t>SOURCE_FILE_PAGE: not applicable — no candidate media file identified (no licence to assert)</w:t>
+      </w:r>
+    </w:p>
+    <w:p>
+      <w:pPr>
+        <w:pStyle w:val="ListBullet"/>
+      </w:pPr>
+      <w:r>
         <w:t>RIGHTS_HOLDER: unconfirmed</w:t>
       </w:r>
     </w:p>
@@ -797,7 +805,7 @@
         <w:pStyle w:val="ListBullet"/>
       </w:pPr>
       <w:r>
-        <w:t>CHECKED_DATE: 2026-09-05</w:t>
+        <w:t>CHECKED_DATE: 2026-09-06</w:t>
       </w:r>
     </w:p>
     <w:p>
@@ -813,7 +821,23 @@
         <w:pStyle w:val="ListBullet"/>
       </w:pPr>
       <w:r>
+        <w:t>IMAGE_SCOPE_NOTE: match the exact model family/topic only; must not imply a specific trim/model-year, real VIN, in-person inspection or actual transaction</w:t>
+      </w:r>
+    </w:p>
+    <w:p>
+      <w:pPr>
+        <w:pStyle w:val="ListBullet"/>
+      </w:pPr>
+      <w:r>
         <w:t>IMAGE_RIGHTS_STATUS: FAIL (no licensed asset captured; a placeholder or “retain old image” note is not accepted)</w:t>
+      </w:r>
+    </w:p>
+    <w:p>
+      <w:pPr>
+        <w:pStyle w:val="ListBullet"/>
+      </w:pPr>
+      <w:r>
+        <w:t>BLOCK_REASON: No reusable image could be secured: Wikimedia Commons/Flickr are unreachable from the research environment, stock libraries require authenticated API/licence access, and an OEM webpage image is NOT a commercial reuse grant; no AutoBridge-owned photo exists. Kept FAIL rather than asserted.</w:t>
       </w:r>
     </w:p>
     <w:p>

</xml_diff>